<commit_message>
Add August 10 and September 7 client meetings to individual report attendance.
Include Week 9 meeting minutes on sensors, block diagram, and Project 15 CSV guidance.

Co-authored-by: Amit shrestha <Amit-shrestha63@users.noreply.github.com>
</commit_message>
<xml_diff>
--- a/MDA691_Individual_Report_Amit_Shrestha.docx
+++ b/MDA691_Individual_Report_Amit_Shrestha.docx
@@ -399,10 +399,9 @@
         <w:rPr>
           <w:rFonts w:ascii="Times New Roman" w:hAnsi="Times New Roman" w:eastAsia="Times New Roman"/>
           <w:b w:val="0"/>
-          <w:i w:val="0"/>
-          <w:sz w:val="22"/>
+          <w:sz w:val="20"/>
         </w:rPr>
-        <w:t>Attended client meetings 10, 17 and 24 August 2026; participated in Week 7 hardware session and witnessed DS18B20 smoke test (23.125 °C).</w:t>
+        <w:t>Attended client meetings 10 and 17 August, 24 August, and 7 September 2026; participated in Week 7 hardware session and witnessed DS18B20 smoke test (23.125 °C).</w:t>
       </w:r>
     </w:p>
     <w:p>
@@ -455,7 +454,6 @@
               <w:rPr>
                 <w:rFonts w:ascii="Times New Roman" w:hAnsi="Times New Roman" w:eastAsia="Times New Roman"/>
                 <w:b/>
-                <w:i w:val="0"/>
                 <w:sz w:val="20"/>
               </w:rPr>
               <w:t>Week</w:t>
@@ -471,7 +469,6 @@
               <w:rPr>
                 <w:rFonts w:ascii="Times New Roman" w:hAnsi="Times New Roman" w:eastAsia="Times New Roman"/>
                 <w:b/>
-                <w:i w:val="0"/>
                 <w:sz w:val="20"/>
               </w:rPr>
               <w:t>Tutorial / supervision</w:t>
@@ -487,7 +484,6 @@
               <w:rPr>
                 <w:rFonts w:ascii="Times New Roman" w:hAnsi="Times New Roman" w:eastAsia="Times New Roman"/>
                 <w:b/>
-                <w:i w:val="0"/>
                 <w:sz w:val="20"/>
               </w:rPr>
               <w:t>Client / extra</w:t>
@@ -505,7 +501,53 @@
               <w:rPr>
                 <w:rFonts w:ascii="Times New Roman" w:hAnsi="Times New Roman" w:eastAsia="Times New Roman"/>
                 <w:b w:val="0"/>
-                <w:i w:val="0"/>
+                <w:sz w:val="20"/>
+              </w:rPr>
+              <w:t>4</w:t>
+            </w:r>
+          </w:p>
+        </w:tc>
+        <w:tc>
+          <w:tcPr>
+            <w:tcW w:type="dxa" w:w="2880"/>
+          </w:tcPr>
+          <w:p>
+            <w:r>
+              <w:rPr>
+                <w:rFonts w:ascii="Times New Roman" w:hAnsi="Times New Roman" w:eastAsia="Times New Roman"/>
+                <w:b w:val="0"/>
+                <w:sz w:val="20"/>
+              </w:rPr>
+              <w:t>Present</w:t>
+            </w:r>
+          </w:p>
+        </w:tc>
+        <w:tc>
+          <w:tcPr>
+            <w:tcW w:type="dxa" w:w="2880"/>
+          </w:tcPr>
+          <w:p>
+            <w:r>
+              <w:rPr>
+                <w:rFonts w:ascii="Times New Roman" w:hAnsi="Times New Roman" w:eastAsia="Times New Roman"/>
+                <w:b w:val="0"/>
+                <w:sz w:val="18"/>
+              </w:rPr>
+              <w:t>Client meeting 10/08/2026 — intro, document review, meeting schedule (all team; Miroslav Kostecki)</w:t>
+            </w:r>
+          </w:p>
+        </w:tc>
+      </w:tr>
+      <w:tr>
+        <w:tc>
+          <w:tcPr>
+            <w:tcW w:type="dxa" w:w="2880"/>
+          </w:tcPr>
+          <w:p>
+            <w:r>
+              <w:rPr>
+                <w:rFonts w:ascii="Times New Roman" w:hAnsi="Times New Roman" w:eastAsia="Times New Roman"/>
+                <w:b w:val="0"/>
                 <w:sz w:val="20"/>
               </w:rPr>
               <w:t>5</w:t>
@@ -521,7 +563,6 @@
               <w:rPr>
                 <w:rFonts w:ascii="Times New Roman" w:hAnsi="Times New Roman" w:eastAsia="Times New Roman"/>
                 <w:b w:val="0"/>
-                <w:i w:val="0"/>
                 <w:sz w:val="20"/>
               </w:rPr>
               <w:t>Present</w:t>
@@ -537,8 +578,7 @@
               <w:rPr>
                 <w:rFonts w:ascii="Times New Roman" w:hAnsi="Times New Roman" w:eastAsia="Times New Roman"/>
                 <w:b w:val="0"/>
-                <w:i w:val="0"/>
-                <w:sz w:val="20"/>
+                <w:sz w:val="18"/>
               </w:rPr>
               <w:t>—</w:t>
             </w:r>
@@ -555,7 +595,6 @@
               <w:rPr>
                 <w:rFonts w:ascii="Times New Roman" w:hAnsi="Times New Roman" w:eastAsia="Times New Roman"/>
                 <w:b w:val="0"/>
-                <w:i w:val="0"/>
                 <w:sz w:val="20"/>
               </w:rPr>
               <w:t>6</w:t>
@@ -571,7 +610,6 @@
               <w:rPr>
                 <w:rFonts w:ascii="Times New Roman" w:hAnsi="Times New Roman" w:eastAsia="Times New Roman"/>
                 <w:b w:val="0"/>
-                <w:i w:val="0"/>
                 <w:sz w:val="20"/>
               </w:rPr>
               <w:t>Present</w:t>
@@ -587,10 +625,9 @@
               <w:rPr>
                 <w:rFonts w:ascii="Times New Roman" w:hAnsi="Times New Roman" w:eastAsia="Times New Roman"/>
                 <w:b w:val="0"/>
-                <w:i w:val="0"/>
-                <w:sz w:val="20"/>
+                <w:sz w:val="18"/>
               </w:rPr>
-              <w:t>Client meeting 17/08/2026 (runlinc hotspot setup)</w:t>
+              <w:t>Client meeting 17/08/2026 — runlinc hotspot setup and connection troubleshooting</w:t>
             </w:r>
           </w:p>
         </w:tc>
@@ -605,7 +642,6 @@
               <w:rPr>
                 <w:rFonts w:ascii="Times New Roman" w:hAnsi="Times New Roman" w:eastAsia="Times New Roman"/>
                 <w:b w:val="0"/>
-                <w:i w:val="0"/>
                 <w:sz w:val="20"/>
               </w:rPr>
               <w:t>7</w:t>
@@ -621,7 +657,6 @@
               <w:rPr>
                 <w:rFonts w:ascii="Times New Roman" w:hAnsi="Times New Roman" w:eastAsia="Times New Roman"/>
                 <w:b w:val="0"/>
-                <w:i w:val="0"/>
                 <w:sz w:val="20"/>
               </w:rPr>
               <w:t>Present</w:t>
@@ -637,10 +672,9 @@
               <w:rPr>
                 <w:rFonts w:ascii="Times New Roman" w:hAnsi="Times New Roman" w:eastAsia="Times New Roman"/>
                 <w:b w:val="0"/>
-                <w:i w:val="0"/>
-                <w:sz w:val="20"/>
+                <w:sz w:val="18"/>
               </w:rPr>
-              <w:t>Client meeting 24/08/2026 (hardware; Projects 14/15)</w:t>
+              <w:t>Client meeting 24/08/2026 — hardware setup; LED blink; runlinc Projects 14/15</w:t>
             </w:r>
           </w:p>
         </w:tc>
@@ -655,7 +689,6 @@
               <w:rPr>
                 <w:rFonts w:ascii="Times New Roman" w:hAnsi="Times New Roman" w:eastAsia="Times New Roman"/>
                 <w:b w:val="0"/>
-                <w:i w:val="0"/>
                 <w:sz w:val="20"/>
               </w:rPr>
               <w:t>8</w:t>
@@ -671,7 +704,6 @@
               <w:rPr>
                 <w:rFonts w:ascii="Times New Roman" w:hAnsi="Times New Roman" w:eastAsia="Times New Roman"/>
                 <w:b w:val="0"/>
-                <w:i w:val="0"/>
                 <w:sz w:val="20"/>
               </w:rPr>
               <w:t>Present</w:t>
@@ -687,10 +719,56 @@
               <w:rPr>
                 <w:rFonts w:ascii="Times New Roman" w:hAnsi="Times New Roman" w:eastAsia="Times New Roman"/>
                 <w:b w:val="0"/>
-                <w:i w:val="0"/>
+                <w:sz w:val="18"/>
+              </w:rPr>
+              <w:t>Supervisor feedback; Assignment 2 report preparation</w:t>
+            </w:r>
+          </w:p>
+        </w:tc>
+      </w:tr>
+      <w:tr>
+        <w:tc>
+          <w:tcPr>
+            <w:tcW w:type="dxa" w:w="2880"/>
+          </w:tcPr>
+          <w:p>
+            <w:r>
+              <w:rPr>
+                <w:rFonts w:ascii="Times New Roman" w:hAnsi="Times New Roman" w:eastAsia="Times New Roman"/>
+                <w:b w:val="0"/>
                 <w:sz w:val="20"/>
               </w:rPr>
-              <w:t>Supervisor feedback; A2 report preparation</w:t>
+              <w:t>9</w:t>
+            </w:r>
+          </w:p>
+        </w:tc>
+        <w:tc>
+          <w:tcPr>
+            <w:tcW w:type="dxa" w:w="2880"/>
+          </w:tcPr>
+          <w:p>
+            <w:r>
+              <w:rPr>
+                <w:rFonts w:ascii="Times New Roman" w:hAnsi="Times New Roman" w:eastAsia="Times New Roman"/>
+                <w:b w:val="0"/>
+                <w:sz w:val="20"/>
+              </w:rPr>
+              <w:t>Present</w:t>
+            </w:r>
+          </w:p>
+        </w:tc>
+        <w:tc>
+          <w:tcPr>
+            <w:tcW w:type="dxa" w:w="2880"/>
+          </w:tcPr>
+          <w:p>
+            <w:r>
+              <w:rPr>
+                <w:rFonts w:ascii="Times New Roman" w:hAnsi="Times New Roman" w:eastAsia="Times New Roman"/>
+                <w:b w:val="0"/>
+                <w:sz w:val="18"/>
+              </w:rPr>
+              <w:t>Client meeting 07/09/2026 — sensors, block diagram, Project 15 CSV save/retrieve, lifespan/PdM discussion</w:t>
             </w:r>
           </w:p>
         </w:tc>
@@ -1540,6 +1618,20 @@
         <w:t>Date: 13 September 2026</w:t>
       </w:r>
     </w:p>
+    <w:p>
+      <w:pPr>
+        <w:pStyle w:val="ListBullet"/>
+      </w:pPr>
+      <w:r/>
+      <w:r>
+        <w:rPr>
+          <w:rFonts w:ascii="Times New Roman" w:hAnsi="Times New Roman" w:eastAsia="Times New Roman"/>
+          <w:b w:val="0"/>
+          <w:sz w:val="20"/>
+        </w:rPr>
+        <w:t>Week 9 (07/09/2026): documented client meeting on sensor selection, block diagram, equipment lifespan/PdM, and Runlinc Intermediate Project 15 (CSV save/retrieve).</w:t>
+      </w:r>
+    </w:p>
     <w:sectPr>
       <w:pgSz w:w="12240" w:h="15840"/>
       <w:pgMar w:top="1440" w:right="1800" w:bottom="1440" w:left="1800" w:header="720" w:footer="720" w:gutter="0"/>

</xml_diff>